<commit_message>
chore: add gitignore and clean tracked cache files
</commit_message>
<xml_diff>
--- a/报告.docx
+++ b/报告.docx
@@ -494,7 +494,19 @@
         <w:rPr>
           <w:rFonts w:hint="eastAsia"/>
         </w:rPr>
-        <w:t>产品体验链接：待部署后填写</w:t>
+        <w:t>产品体验链接：</w:t>
+      </w:r>
+      <w:hyperlink r:id="rId5" w:history="1">
+        <w:r>
+          <w:rPr>
+            <w:color w:val="0000FF"/>
+            <w:u w:val="single"/>
+          </w:rPr>
+          <w:t>Streamlit</w:t>
+        </w:r>
+      </w:hyperlink>
+      <w:r>
+        <w:t xml:space="preserve"> </w:t>
       </w:r>
     </w:p>
     <w:p>
@@ -1530,7 +1542,7 @@
                     <pic:cNvPicPr/>
                   </pic:nvPicPr>
                   <pic:blipFill>
-                    <a:blip r:embed="rId5"/>
+                    <a:blip r:embed="rId6"/>
                     <a:stretch>
                       <a:fillRect/>
                     </a:stretch>
@@ -1576,7 +1588,7 @@
                     <pic:cNvPicPr/>
                   </pic:nvPicPr>
                   <pic:blipFill>
-                    <a:blip r:embed="rId6"/>
+                    <a:blip r:embed="rId7"/>
                     <a:stretch>
                       <a:fillRect/>
                     </a:stretch>
@@ -2465,7 +2477,7 @@
                     <pic:cNvPicPr/>
                   </pic:nvPicPr>
                   <pic:blipFill>
-                    <a:blip r:embed="rId7"/>
+                    <a:blip r:embed="rId8"/>
                     <a:stretch>
                       <a:fillRect/>
                     </a:stretch>
@@ -2508,7 +2520,7 @@
                     <pic:cNvPicPr/>
                   </pic:nvPicPr>
                   <pic:blipFill>
-                    <a:blip r:embed="rId8"/>
+                    <a:blip r:embed="rId9"/>
                     <a:stretch>
                       <a:fillRect/>
                     </a:stretch>
@@ -2553,7 +2565,7 @@
                     <pic:cNvPicPr/>
                   </pic:nvPicPr>
                   <pic:blipFill>
-                    <a:blip r:embed="rId9"/>
+                    <a:blip r:embed="rId10"/>
                     <a:stretch>
                       <a:fillRect/>
                     </a:stretch>
@@ -4696,11 +4708,6 @@
       <w:pPr>
         <w:spacing w:line="276" w:lineRule="auto"/>
       </w:pPr>
-      <w:r>
-        <w:pict w14:anchorId="4A1847D4">
-          <v:rect id="_x0000_i1029" style="width:0;height:1.5pt" o:hralign="center" o:hrstd="t" o:hr="t"/>
-        </w:pict>
-      </w:r>
     </w:p>
     <w:p>
       <w:pPr>
@@ -12001,32 +12008,125 @@
     <w:p>
       <w:pPr>
         <w:spacing w:line="276" w:lineRule="auto"/>
-      </w:pPr>
-    </w:p>
-    <w:p>
-      <w:pPr>
-        <w:pStyle w:val="3"/>
-        <w:spacing w:line="276" w:lineRule="auto"/>
-        <w:rPr>
-          <w:color w:val="auto"/>
-        </w:rPr>
-      </w:pPr>
-      <w:bookmarkStart w:id="78" w:name="十五本地安装与部署"/>
-      <w:bookmarkStart w:id="79" w:name="streamlit-community-cloud-部署"/>
+        <w:rPr>
+          <w:rFonts w:hint="eastAsia"/>
+        </w:rPr>
+      </w:pPr>
+    </w:p>
+    <w:p>
+      <w:pPr>
+        <w:pStyle w:val="2"/>
+        <w:spacing w:line="276" w:lineRule="auto"/>
+        <w:rPr>
+          <w:color w:val="auto"/>
+        </w:rPr>
+      </w:pPr>
+      <w:bookmarkStart w:id="78" w:name="十八产品亮点"/>
       <w:bookmarkEnd w:id="74"/>
       <w:bookmarkEnd w:id="77"/>
       <w:r>
         <w:rPr>
-          <w:color w:val="auto"/>
-        </w:rPr>
-        <w:t xml:space="preserve">15.3 Streamlit Community Cloud </w:t>
-      </w:r>
-      <w:r>
-        <w:rPr>
-          <w:rFonts w:hint="eastAsia"/>
-          <w:color w:val="auto"/>
-        </w:rPr>
-        <w:t>部署</w:t>
+          <w:rFonts w:hint="eastAsia"/>
+          <w:color w:val="auto"/>
+        </w:rPr>
+        <w:t>十八、产品亮点</w:t>
+      </w:r>
+    </w:p>
+    <w:p>
+      <w:pPr>
+        <w:pStyle w:val="3"/>
+        <w:spacing w:line="276" w:lineRule="auto"/>
+        <w:rPr>
+          <w:color w:val="auto"/>
+        </w:rPr>
+      </w:pPr>
+      <w:bookmarkStart w:id="79" w:name="保留教师控制权"/>
+      <w:r>
+        <w:rPr>
+          <w:color w:val="auto"/>
+        </w:rPr>
+        <w:t>18.</w:t>
+      </w:r>
+      <w:r>
+        <w:rPr>
+          <w:rFonts w:hint="eastAsia"/>
+          <w:color w:val="auto"/>
+        </w:rPr>
+        <w:t>1</w:t>
+      </w:r>
+      <w:r>
+        <w:rPr>
+          <w:color w:val="auto"/>
+        </w:rPr>
+        <w:t xml:space="preserve"> </w:t>
+      </w:r>
+      <w:r>
+        <w:rPr>
+          <w:rFonts w:hint="eastAsia"/>
+          <w:color w:val="auto"/>
+        </w:rPr>
+        <w:t>保留教师控制权</w:t>
+      </w:r>
+    </w:p>
+    <w:p>
+      <w:pPr>
+        <w:pStyle w:val="FirstParagraph"/>
+        <w:spacing w:line="276" w:lineRule="auto"/>
+      </w:pPr>
+      <w:r>
+        <w:rPr>
+          <w:rFonts w:hint="eastAsia"/>
+        </w:rPr>
+        <w:t>教师可以修改权重，最终评分规则由程序执行，而不是完全由模型决定。</w:t>
+      </w:r>
+    </w:p>
+    <w:p>
+      <w:pPr>
+        <w:pStyle w:val="3"/>
+        <w:spacing w:line="276" w:lineRule="auto"/>
+        <w:rPr>
+          <w:color w:val="auto"/>
+        </w:rPr>
+      </w:pPr>
+      <w:bookmarkStart w:id="80" w:name="评分过程可解释"/>
+      <w:bookmarkEnd w:id="79"/>
+      <w:r>
+        <w:rPr>
+          <w:color w:val="auto"/>
+        </w:rPr>
+        <w:t>18.</w:t>
+      </w:r>
+      <w:r>
+        <w:rPr>
+          <w:rFonts w:hint="eastAsia"/>
+          <w:color w:val="auto"/>
+        </w:rPr>
+        <w:t>2</w:t>
+      </w:r>
+      <w:r>
+        <w:rPr>
+          <w:color w:val="auto"/>
+        </w:rPr>
+        <w:t xml:space="preserve"> </w:t>
+      </w:r>
+      <w:r>
+        <w:rPr>
+          <w:rFonts w:hint="eastAsia"/>
+          <w:color w:val="auto"/>
+        </w:rPr>
+        <w:t>评分过程可解释</w:t>
+      </w:r>
+    </w:p>
+    <w:p>
+      <w:pPr>
+        <w:pStyle w:val="FirstParagraph"/>
+        <w:spacing w:line="276" w:lineRule="auto"/>
+      </w:pPr>
+      <w:r>
+        <w:rPr>
+          <w:rFonts w:hint="eastAsia"/>
+        </w:rPr>
+        <w:t>系统展示：</w:t>
       </w:r>
     </w:p>
     <w:p>
@@ -12042,13 +12142,7 @@
         <w:rPr>
           <w:rFonts w:hint="eastAsia"/>
         </w:rPr>
-        <w:t>将项目上传到</w:t>
-      </w:r>
-      <w:r>
-        <w:t xml:space="preserve"> GitHub</w:t>
-      </w:r>
-      <w:r>
-        <w:t>。</w:t>
+        <w:t>使用了什么提示词</w:t>
       </w:r>
     </w:p>
     <w:p>
@@ -12064,13 +12158,7 @@
         <w:rPr>
           <w:rFonts w:hint="eastAsia"/>
         </w:rPr>
-        <w:t>登录</w:t>
-      </w:r>
-      <w:r>
-        <w:t xml:space="preserve"> Streamlit Community Cloud</w:t>
-      </w:r>
-      <w:r>
-        <w:t>。</w:t>
+        <w:t>使用了什么评分维度</w:t>
       </w:r>
     </w:p>
     <w:p>
@@ -12086,16 +12174,7 @@
         <w:rPr>
           <w:rFonts w:hint="eastAsia"/>
         </w:rPr>
-        <w:t>创建应用并选择</w:t>
-      </w:r>
-      <w:r>
-        <w:t xml:space="preserve"> GitHub </w:t>
-      </w:r>
-      <w:r>
-        <w:rPr>
-          <w:rFonts w:hint="eastAsia"/>
-        </w:rPr>
-        <w:t>仓库。</w:t>
+        <w:t>模型发现了什么问题</w:t>
       </w:r>
     </w:p>
     <w:p>
@@ -12111,19 +12190,202 @@
         <w:rPr>
           <w:rFonts w:hint="eastAsia"/>
         </w:rPr>
-        <w:t>入口文件填写：</w:t>
-      </w:r>
-    </w:p>
-    <w:p>
-      <w:pPr>
-        <w:pStyle w:val="SourceCode"/>
-        <w:spacing w:line="276" w:lineRule="auto"/>
-      </w:pPr>
-      <w:r>
-        <w:rPr>
-          <w:rStyle w:val="VerbatimChar"/>
-        </w:rPr>
-        <w:t>teacher_grading_assistant/app.py</w:t>
+        <w:t>问题对应什么证据</w:t>
+      </w:r>
+    </w:p>
+    <w:p>
+      <w:pPr>
+        <w:pStyle w:val="Compact"/>
+        <w:numPr>
+          <w:ilvl w:val="0"/>
+          <w:numId w:val="40"/>
+        </w:numPr>
+        <w:spacing w:line="276" w:lineRule="auto"/>
+      </w:pPr>
+      <w:r>
+        <w:rPr>
+          <w:rFonts w:hint="eastAsia"/>
+        </w:rPr>
+        <w:t>是否触发硬性限分</w:t>
+      </w:r>
+    </w:p>
+    <w:p>
+      <w:pPr>
+        <w:pStyle w:val="Compact"/>
+        <w:numPr>
+          <w:ilvl w:val="0"/>
+          <w:numId w:val="40"/>
+        </w:numPr>
+        <w:spacing w:line="276" w:lineRule="auto"/>
+      </w:pPr>
+      <w:r>
+        <w:rPr>
+          <w:rFonts w:hint="eastAsia"/>
+        </w:rPr>
+        <w:lastRenderedPageBreak/>
+        <w:t>总分是如何计算的</w:t>
+      </w:r>
+    </w:p>
+    <w:p>
+      <w:pPr>
+        <w:pStyle w:val="3"/>
+        <w:spacing w:line="276" w:lineRule="auto"/>
+        <w:rPr>
+          <w:color w:val="auto"/>
+        </w:rPr>
+      </w:pPr>
+      <w:bookmarkStart w:id="81" w:name="无-key-也能演示"/>
+      <w:bookmarkEnd w:id="80"/>
+      <w:r>
+        <w:rPr>
+          <w:color w:val="auto"/>
+        </w:rPr>
+        <w:t xml:space="preserve">18.4 </w:t>
+      </w:r>
+      <w:r>
+        <w:rPr>
+          <w:rFonts w:hint="eastAsia"/>
+          <w:color w:val="auto"/>
+        </w:rPr>
+        <w:t>无</w:t>
+      </w:r>
+      <w:r>
+        <w:rPr>
+          <w:color w:val="auto"/>
+        </w:rPr>
+        <w:t xml:space="preserve"> Key </w:t>
+      </w:r>
+      <w:r>
+        <w:rPr>
+          <w:rFonts w:hint="eastAsia"/>
+          <w:color w:val="auto"/>
+        </w:rPr>
+        <w:t>也能演示</w:t>
+      </w:r>
+    </w:p>
+    <w:p>
+      <w:pPr>
+        <w:pStyle w:val="FirstParagraph"/>
+        <w:spacing w:line="276" w:lineRule="auto"/>
+      </w:pPr>
+      <w:r>
+        <w:t xml:space="preserve">Mock </w:t>
+      </w:r>
+      <w:r>
+        <w:rPr>
+          <w:rFonts w:hint="eastAsia"/>
+        </w:rPr>
+        <w:t>模式保证课程展示不受网络、额度和</w:t>
+      </w:r>
+      <w:r>
+        <w:t xml:space="preserve"> API Key </w:t>
+      </w:r>
+      <w:r>
+        <w:rPr>
+          <w:rFonts w:hint="eastAsia"/>
+        </w:rPr>
+        <w:t>影响。</w:t>
+      </w:r>
+    </w:p>
+    <w:p>
+      <w:pPr>
+        <w:spacing w:line="276" w:lineRule="auto"/>
+      </w:pPr>
+    </w:p>
+    <w:p>
+      <w:pPr>
+        <w:pStyle w:val="2"/>
+        <w:spacing w:line="276" w:lineRule="auto"/>
+        <w:rPr>
+          <w:color w:val="auto"/>
+        </w:rPr>
+      </w:pPr>
+      <w:bookmarkStart w:id="82" w:name="二十二总结"/>
+      <w:bookmarkEnd w:id="78"/>
+      <w:bookmarkEnd w:id="81"/>
+      <w:r>
+        <w:rPr>
+          <w:rFonts w:hint="eastAsia"/>
+          <w:color w:val="auto"/>
+        </w:rPr>
+        <w:t>十</w:t>
+      </w:r>
+      <w:r>
+        <w:rPr>
+          <w:rFonts w:hint="eastAsia"/>
+          <w:color w:val="auto"/>
+        </w:rPr>
+        <w:t>九</w:t>
+      </w:r>
+      <w:r>
+        <w:rPr>
+          <w:rFonts w:hint="eastAsia"/>
+          <w:color w:val="auto"/>
+        </w:rPr>
+        <w:t>、总结</w:t>
+      </w:r>
+    </w:p>
+    <w:p>
+      <w:pPr>
+        <w:pStyle w:val="FirstParagraph"/>
+        <w:spacing w:line="276" w:lineRule="auto"/>
+      </w:pPr>
+      <w:r>
+        <w:rPr>
+          <w:rFonts w:hint="eastAsia"/>
+        </w:rPr>
+        <w:t>教师作业批改助手通过</w:t>
+      </w:r>
+      <w:r>
+        <w:t xml:space="preserve"> Python</w:t>
+      </w:r>
+      <w:r>
+        <w:t>、</w:t>
+      </w:r>
+      <w:r>
+        <w:t xml:space="preserve">Streamlit </w:t>
+      </w:r>
+      <w:r>
+        <w:rPr>
+          <w:rFonts w:hint="eastAsia"/>
+        </w:rPr>
+        <w:t>和现有大模型</w:t>
+      </w:r>
+      <w:r>
+        <w:t xml:space="preserve"> </w:t>
+      </w:r>
+      <w:r>
+        <w:rPr>
+          <w:rFonts w:hint="eastAsia"/>
+        </w:rPr>
+        <w:t>API</w:t>
+      </w:r>
+      <w:r>
+        <w:rPr>
+          <w:rFonts w:hint="eastAsia"/>
+        </w:rPr>
+        <w:t>，实现了一个可运行、可部署、适合课程展示的</w:t>
+      </w:r>
+      <w:r>
+        <w:t xml:space="preserve"> AI Agent </w:t>
+      </w:r>
+      <w:r>
+        <w:rPr>
+          <w:rFonts w:hint="eastAsia"/>
+        </w:rPr>
+        <w:t>产品。</w:t>
+      </w:r>
+    </w:p>
+    <w:p>
+      <w:pPr>
+        <w:pStyle w:val="a0"/>
+        <w:spacing w:line="276" w:lineRule="auto"/>
+      </w:pPr>
+      <w:r>
+        <w:rPr>
+          <w:rFonts w:hint="eastAsia"/>
+        </w:rPr>
+        <w:t>产品的核心价值不在于简单调用大模型，而在于将提示词工程转化为完整产品机制：</w:t>
       </w:r>
     </w:p>
     <w:p>
@@ -12139,158 +12401,128 @@
         <w:rPr>
           <w:rFonts w:hint="eastAsia"/>
         </w:rPr>
-        <w:t>在</w:t>
-      </w:r>
-      <w:r>
-        <w:t xml:space="preserve"> Secrets </w:t>
-      </w:r>
-      <w:r>
-        <w:rPr>
-          <w:rFonts w:hint="eastAsia"/>
-        </w:rPr>
-        <w:t>中配置</w:t>
-      </w:r>
-      <w:r>
-        <w:t xml:space="preserve"> API </w:t>
-      </w:r>
-      <w:r>
-        <w:rPr>
-          <w:rFonts w:hint="eastAsia"/>
-        </w:rPr>
-        <w:t>Key</w:t>
-      </w:r>
-      <w:r>
-        <w:rPr>
-          <w:rFonts w:hint="eastAsia"/>
-        </w:rPr>
-        <w:t>：</w:t>
-      </w:r>
-    </w:p>
-    <w:p>
-      <w:pPr>
-        <w:pStyle w:val="SourceCode"/>
-        <w:spacing w:line="276" w:lineRule="auto"/>
-      </w:pPr>
-      <w:r>
-        <w:rPr>
-          <w:rStyle w:val="DataTypeTok"/>
-          <w:color w:val="auto"/>
-        </w:rPr>
-        <w:t>ZHIPU_API_KEY</w:t>
-      </w:r>
-      <w:r>
-        <w:rPr>
-          <w:rStyle w:val="NormalTok"/>
-        </w:rPr>
-        <w:t xml:space="preserve"> </w:t>
-      </w:r>
-      <w:r>
-        <w:rPr>
-          <w:rStyle w:val="OperatorTok"/>
-          <w:color w:val="auto"/>
-        </w:rPr>
-        <w:t>=</w:t>
-      </w:r>
-      <w:r>
-        <w:rPr>
-          <w:rStyle w:val="NormalTok"/>
-        </w:rPr>
-        <w:t xml:space="preserve"> </w:t>
-      </w:r>
-      <w:r>
-        <w:rPr>
-          <w:rStyle w:val="StringTok"/>
-          <w:color w:val="auto"/>
-        </w:rPr>
-        <w:t>"your_zhipu_api_key_here"</w:t>
-      </w:r>
-      <w:r>
-        <w:br/>
-      </w:r>
-      <w:r>
-        <w:rPr>
-          <w:rStyle w:val="DataTypeTok"/>
-          <w:color w:val="auto"/>
-        </w:rPr>
-        <w:t>ZHIPU_BASE_URL</w:t>
-      </w:r>
-      <w:r>
-        <w:rPr>
-          <w:rStyle w:val="NormalTok"/>
-        </w:rPr>
-        <w:t xml:space="preserve"> </w:t>
-      </w:r>
-      <w:r>
-        <w:rPr>
-          <w:rStyle w:val="OperatorTok"/>
-          <w:color w:val="auto"/>
-        </w:rPr>
-        <w:t>=</w:t>
-      </w:r>
-      <w:r>
-        <w:rPr>
-          <w:rStyle w:val="NormalTok"/>
-        </w:rPr>
-        <w:t xml:space="preserve"> </w:t>
-      </w:r>
-      <w:r>
-        <w:rPr>
-          <w:rStyle w:val="StringTok"/>
-          <w:color w:val="auto"/>
-        </w:rPr>
-        <w:t>"https://open.bigmodel.cn/api/paas/v4"</w:t>
-      </w:r>
-      <w:r>
-        <w:br/>
-      </w:r>
-      <w:r>
-        <w:rPr>
-          <w:rStyle w:val="DataTypeTok"/>
-          <w:color w:val="auto"/>
-        </w:rPr>
-        <w:t>ZHIPU_MODEL</w:t>
-      </w:r>
-      <w:r>
-        <w:rPr>
-          <w:rStyle w:val="NormalTok"/>
-        </w:rPr>
-        <w:t xml:space="preserve"> </w:t>
-      </w:r>
-      <w:r>
-        <w:rPr>
-          <w:rStyle w:val="OperatorTok"/>
-          <w:color w:val="auto"/>
-        </w:rPr>
-        <w:t>=</w:t>
-      </w:r>
-      <w:r>
-        <w:rPr>
-          <w:rStyle w:val="NormalTok"/>
-        </w:rPr>
-        <w:t xml:space="preserve"> </w:t>
-      </w:r>
-      <w:r>
-        <w:rPr>
-          <w:rStyle w:val="StringTok"/>
-          <w:color w:val="auto"/>
-        </w:rPr>
-        <w:t>"glm-4-flash"</w:t>
-      </w:r>
-    </w:p>
-    <w:p>
-      <w:pPr>
-        <w:pStyle w:val="Compact"/>
-        <w:numPr>
-          <w:ilvl w:val="0"/>
-          <w:numId w:val="42"/>
-        </w:numPr>
-        <w:spacing w:line="276" w:lineRule="auto"/>
-      </w:pPr>
-      <w:r>
-        <w:rPr>
-          <w:rFonts w:hint="eastAsia"/>
-        </w:rPr>
-        <w:t>完成部署后测试</w:t>
+        <w:t>使用课程化评分标准控制上下文。</w:t>
+      </w:r>
+    </w:p>
+    <w:p>
+      <w:pPr>
+        <w:pStyle w:val="Compact"/>
+        <w:numPr>
+          <w:ilvl w:val="0"/>
+          <w:numId w:val="41"/>
+        </w:numPr>
+        <w:spacing w:line="276" w:lineRule="auto"/>
+      </w:pPr>
+      <w:r>
+        <w:rPr>
+          <w:rFonts w:hint="eastAsia"/>
+        </w:rPr>
+        <w:t>使用任务分解提高输出完整性。</w:t>
+      </w:r>
+    </w:p>
+    <w:p>
+      <w:pPr>
+        <w:pStyle w:val="Compact"/>
+        <w:numPr>
+          <w:ilvl w:val="0"/>
+          <w:numId w:val="41"/>
+        </w:numPr>
+        <w:spacing w:line="276" w:lineRule="auto"/>
+      </w:pPr>
+      <w:r>
+        <w:rPr>
+          <w:rFonts w:hint="eastAsia"/>
+        </w:rPr>
+        <w:t>使用固定</w:t>
+      </w:r>
+      <w:r>
+        <w:t xml:space="preserve"> JSON </w:t>
+      </w:r>
+      <w:r>
+        <w:rPr>
+          <w:rFonts w:hint="eastAsia"/>
+        </w:rPr>
+        <w:t>提高结果稳定性。</w:t>
+      </w:r>
+    </w:p>
+    <w:p>
+      <w:pPr>
+        <w:pStyle w:val="Compact"/>
+        <w:numPr>
+          <w:ilvl w:val="0"/>
+          <w:numId w:val="41"/>
+        </w:numPr>
+        <w:spacing w:line="276" w:lineRule="auto"/>
+      </w:pPr>
+      <w:r>
+        <w:rPr>
+          <w:rFonts w:hint="eastAsia"/>
+        </w:rPr>
+        <w:t>使用教师权重保留教师评价权。</w:t>
+      </w:r>
+    </w:p>
+    <w:p>
+      <w:pPr>
+        <w:pStyle w:val="Compact"/>
+        <w:numPr>
+          <w:ilvl w:val="0"/>
+          <w:numId w:val="41"/>
+        </w:numPr>
+        <w:spacing w:line="276" w:lineRule="auto"/>
+      </w:pPr>
+      <w:r>
+        <w:rPr>
+          <w:rFonts w:hint="eastAsia"/>
+        </w:rPr>
+        <w:t>使用程序算分避免模型算术错误。</w:t>
+      </w:r>
+    </w:p>
+    <w:p>
+      <w:pPr>
+        <w:pStyle w:val="Compact"/>
+        <w:numPr>
+          <w:ilvl w:val="0"/>
+          <w:numId w:val="41"/>
+        </w:numPr>
+        <w:spacing w:line="276" w:lineRule="auto"/>
+      </w:pPr>
+      <w:r>
+        <w:rPr>
+          <w:rFonts w:hint="eastAsia"/>
+        </w:rPr>
+        <w:t>使用严重错误限分抑制评分虚高。</w:t>
+      </w:r>
+    </w:p>
+    <w:p>
+      <w:pPr>
+        <w:pStyle w:val="Compact"/>
+        <w:numPr>
+          <w:ilvl w:val="0"/>
+          <w:numId w:val="41"/>
+        </w:numPr>
+        <w:spacing w:line="276" w:lineRule="auto"/>
+      </w:pPr>
+      <w:r>
+        <w:rPr>
+          <w:rFonts w:hint="eastAsia"/>
+        </w:rPr>
+        <w:t>使用证据和建议提升反馈质量。</w:t>
+      </w:r>
+    </w:p>
+    <w:p>
+      <w:pPr>
+        <w:pStyle w:val="Compact"/>
+        <w:numPr>
+          <w:ilvl w:val="0"/>
+          <w:numId w:val="41"/>
+        </w:numPr>
+        <w:spacing w:line="276" w:lineRule="auto"/>
+      </w:pPr>
+      <w:r>
+        <w:rPr>
+          <w:rFonts w:hint="eastAsia"/>
+        </w:rPr>
+        <w:t>使用</w:t>
       </w:r>
       <w:r>
         <w:t xml:space="preserve"> Mock </w:t>
@@ -12299,564 +12531,6 @@
         <w:rPr>
           <w:rFonts w:hint="eastAsia"/>
         </w:rPr>
-        <w:t>和真实</w:t>
-      </w:r>
-      <w:r>
-        <w:t xml:space="preserve"> API</w:t>
-      </w:r>
-      <w:r>
-        <w:t>。</w:t>
-      </w:r>
-    </w:p>
-    <w:p>
-      <w:pPr>
-        <w:pStyle w:val="Compact"/>
-        <w:numPr>
-          <w:ilvl w:val="0"/>
-          <w:numId w:val="42"/>
-        </w:numPr>
-        <w:spacing w:line="276" w:lineRule="auto"/>
-      </w:pPr>
-      <w:r>
-        <w:rPr>
-          <w:rFonts w:hint="eastAsia"/>
-        </w:rPr>
-        <w:t>将部署链接填写到项目</w:t>
-      </w:r>
-      <w:r>
-        <w:t xml:space="preserve"> README</w:t>
-      </w:r>
-      <w:r>
-        <w:t>。</w:t>
-      </w:r>
-    </w:p>
-    <w:p>
-      <w:pPr>
-        <w:spacing w:line="276" w:lineRule="auto"/>
-        <w:rPr>
-          <w:rFonts w:hint="eastAsia"/>
-        </w:rPr>
-      </w:pPr>
-      <w:bookmarkStart w:id="80" w:name="十六异常处理"/>
-      <w:bookmarkEnd w:id="78"/>
-      <w:bookmarkEnd w:id="79"/>
-    </w:p>
-    <w:p>
-      <w:pPr>
-        <w:pStyle w:val="2"/>
-        <w:spacing w:line="276" w:lineRule="auto"/>
-        <w:rPr>
-          <w:color w:val="auto"/>
-        </w:rPr>
-      </w:pPr>
-      <w:bookmarkStart w:id="81" w:name="十八产品亮点"/>
-      <w:bookmarkEnd w:id="80"/>
-      <w:r>
-        <w:rPr>
-          <w:rFonts w:hint="eastAsia"/>
-          <w:color w:val="auto"/>
-        </w:rPr>
-        <w:t>十八、产品亮点</w:t>
-      </w:r>
-    </w:p>
-    <w:p>
-      <w:pPr>
-        <w:pStyle w:val="3"/>
-        <w:spacing w:line="276" w:lineRule="auto"/>
-        <w:rPr>
-          <w:color w:val="auto"/>
-        </w:rPr>
-      </w:pPr>
-      <w:bookmarkStart w:id="82" w:name="保留教师控制权"/>
-      <w:r>
-        <w:rPr>
-          <w:color w:val="auto"/>
-        </w:rPr>
-        <w:t>18.</w:t>
-      </w:r>
-      <w:r>
-        <w:rPr>
-          <w:rFonts w:hint="eastAsia"/>
-          <w:color w:val="auto"/>
-        </w:rPr>
-        <w:t>1</w:t>
-      </w:r>
-      <w:r>
-        <w:rPr>
-          <w:color w:val="auto"/>
-        </w:rPr>
-        <w:t xml:space="preserve"> </w:t>
-      </w:r>
-      <w:r>
-        <w:rPr>
-          <w:rFonts w:hint="eastAsia"/>
-          <w:color w:val="auto"/>
-        </w:rPr>
-        <w:t>保留教师控制权</w:t>
-      </w:r>
-    </w:p>
-    <w:p>
-      <w:pPr>
-        <w:pStyle w:val="FirstParagraph"/>
-        <w:spacing w:line="276" w:lineRule="auto"/>
-      </w:pPr>
-      <w:r>
-        <w:rPr>
-          <w:rFonts w:hint="eastAsia"/>
-        </w:rPr>
-        <w:t>教师可以修改权重，最终评分规则由程序执行，而不是完全由模型决定。</w:t>
-      </w:r>
-    </w:p>
-    <w:p>
-      <w:pPr>
-        <w:pStyle w:val="3"/>
-        <w:spacing w:line="276" w:lineRule="auto"/>
-        <w:rPr>
-          <w:color w:val="auto"/>
-        </w:rPr>
-      </w:pPr>
-      <w:bookmarkStart w:id="83" w:name="评分过程可解释"/>
-      <w:bookmarkEnd w:id="82"/>
-      <w:r>
-        <w:rPr>
-          <w:color w:val="auto"/>
-        </w:rPr>
-        <w:t>18.</w:t>
-      </w:r>
-      <w:r>
-        <w:rPr>
-          <w:rFonts w:hint="eastAsia"/>
-          <w:color w:val="auto"/>
-        </w:rPr>
-        <w:t>2</w:t>
-      </w:r>
-      <w:r>
-        <w:rPr>
-          <w:color w:val="auto"/>
-        </w:rPr>
-        <w:t xml:space="preserve"> </w:t>
-      </w:r>
-      <w:r>
-        <w:rPr>
-          <w:rFonts w:hint="eastAsia"/>
-          <w:color w:val="auto"/>
-        </w:rPr>
-        <w:t>评分过程可解释</w:t>
-      </w:r>
-    </w:p>
-    <w:p>
-      <w:pPr>
-        <w:pStyle w:val="FirstParagraph"/>
-        <w:spacing w:line="276" w:lineRule="auto"/>
-      </w:pPr>
-      <w:r>
-        <w:rPr>
-          <w:rFonts w:hint="eastAsia"/>
-        </w:rPr>
-        <w:t>系统展示：</w:t>
-      </w:r>
-    </w:p>
-    <w:p>
-      <w:pPr>
-        <w:pStyle w:val="Compact"/>
-        <w:numPr>
-          <w:ilvl w:val="0"/>
-          <w:numId w:val="43"/>
-        </w:numPr>
-        <w:spacing w:line="276" w:lineRule="auto"/>
-      </w:pPr>
-      <w:r>
-        <w:rPr>
-          <w:rFonts w:hint="eastAsia"/>
-        </w:rPr>
-        <w:t>使用了什么提示词</w:t>
-      </w:r>
-    </w:p>
-    <w:p>
-      <w:pPr>
-        <w:pStyle w:val="Compact"/>
-        <w:numPr>
-          <w:ilvl w:val="0"/>
-          <w:numId w:val="43"/>
-        </w:numPr>
-        <w:spacing w:line="276" w:lineRule="auto"/>
-      </w:pPr>
-      <w:r>
-        <w:rPr>
-          <w:rFonts w:hint="eastAsia"/>
-        </w:rPr>
-        <w:t>使用了什么评分维度</w:t>
-      </w:r>
-    </w:p>
-    <w:p>
-      <w:pPr>
-        <w:pStyle w:val="Compact"/>
-        <w:numPr>
-          <w:ilvl w:val="0"/>
-          <w:numId w:val="43"/>
-        </w:numPr>
-        <w:spacing w:line="276" w:lineRule="auto"/>
-      </w:pPr>
-      <w:r>
-        <w:rPr>
-          <w:rFonts w:hint="eastAsia"/>
-        </w:rPr>
-        <w:t>模型发现了什么问题</w:t>
-      </w:r>
-    </w:p>
-    <w:p>
-      <w:pPr>
-        <w:pStyle w:val="Compact"/>
-        <w:numPr>
-          <w:ilvl w:val="0"/>
-          <w:numId w:val="43"/>
-        </w:numPr>
-        <w:spacing w:line="276" w:lineRule="auto"/>
-      </w:pPr>
-      <w:r>
-        <w:rPr>
-          <w:rFonts w:hint="eastAsia"/>
-        </w:rPr>
-        <w:t>问题对应什么证据</w:t>
-      </w:r>
-    </w:p>
-    <w:p>
-      <w:pPr>
-        <w:pStyle w:val="Compact"/>
-        <w:numPr>
-          <w:ilvl w:val="0"/>
-          <w:numId w:val="43"/>
-        </w:numPr>
-        <w:spacing w:line="276" w:lineRule="auto"/>
-      </w:pPr>
-      <w:r>
-        <w:rPr>
-          <w:rFonts w:hint="eastAsia"/>
-        </w:rPr>
-        <w:t>是否触发硬性限分</w:t>
-      </w:r>
-    </w:p>
-    <w:p>
-      <w:pPr>
-        <w:pStyle w:val="Compact"/>
-        <w:numPr>
-          <w:ilvl w:val="0"/>
-          <w:numId w:val="43"/>
-        </w:numPr>
-        <w:spacing w:line="276" w:lineRule="auto"/>
-      </w:pPr>
-      <w:r>
-        <w:rPr>
-          <w:rFonts w:hint="eastAsia"/>
-        </w:rPr>
-        <w:t>总分是如何计算的</w:t>
-      </w:r>
-    </w:p>
-    <w:p>
-      <w:pPr>
-        <w:pStyle w:val="3"/>
-        <w:spacing w:line="276" w:lineRule="auto"/>
-        <w:rPr>
-          <w:color w:val="auto"/>
-        </w:rPr>
-      </w:pPr>
-      <w:bookmarkStart w:id="84" w:name="无-key-也能演示"/>
-      <w:bookmarkEnd w:id="83"/>
-      <w:r>
-        <w:rPr>
-          <w:color w:val="auto"/>
-        </w:rPr>
-        <w:t xml:space="preserve">18.4 </w:t>
-      </w:r>
-      <w:r>
-        <w:rPr>
-          <w:rFonts w:hint="eastAsia"/>
-          <w:color w:val="auto"/>
-        </w:rPr>
-        <w:t>无</w:t>
-      </w:r>
-      <w:r>
-        <w:rPr>
-          <w:color w:val="auto"/>
-        </w:rPr>
-        <w:t xml:space="preserve"> Key </w:t>
-      </w:r>
-      <w:r>
-        <w:rPr>
-          <w:rFonts w:hint="eastAsia"/>
-          <w:color w:val="auto"/>
-        </w:rPr>
-        <w:t>也能演示</w:t>
-      </w:r>
-    </w:p>
-    <w:p>
-      <w:pPr>
-        <w:pStyle w:val="FirstParagraph"/>
-        <w:spacing w:line="276" w:lineRule="auto"/>
-      </w:pPr>
-      <w:r>
-        <w:t xml:space="preserve">Mock </w:t>
-      </w:r>
-      <w:r>
-        <w:rPr>
-          <w:rFonts w:hint="eastAsia"/>
-        </w:rPr>
-        <w:t>模式保证课程展示不受网络、额度和</w:t>
-      </w:r>
-      <w:r>
-        <w:t xml:space="preserve"> API Key </w:t>
-      </w:r>
-      <w:r>
-        <w:rPr>
-          <w:rFonts w:hint="eastAsia"/>
-        </w:rPr>
-        <w:t>影响。</w:t>
-      </w:r>
-    </w:p>
-    <w:p>
-      <w:pPr>
-        <w:spacing w:line="276" w:lineRule="auto"/>
-      </w:pPr>
-    </w:p>
-    <w:p>
-      <w:pPr>
-        <w:pStyle w:val="2"/>
-        <w:spacing w:line="276" w:lineRule="auto"/>
-        <w:rPr>
-          <w:color w:val="auto"/>
-        </w:rPr>
-      </w:pPr>
-      <w:bookmarkStart w:id="85" w:name="二十二总结"/>
-      <w:bookmarkEnd w:id="81"/>
-      <w:bookmarkEnd w:id="84"/>
-      <w:r>
-        <w:rPr>
-          <w:rFonts w:hint="eastAsia"/>
-          <w:color w:val="auto"/>
-        </w:rPr>
-        <w:t>十</w:t>
-      </w:r>
-      <w:r>
-        <w:rPr>
-          <w:rFonts w:hint="eastAsia"/>
-          <w:color w:val="auto"/>
-        </w:rPr>
-        <w:t>九</w:t>
-      </w:r>
-      <w:r>
-        <w:rPr>
-          <w:rFonts w:hint="eastAsia"/>
-          <w:color w:val="auto"/>
-        </w:rPr>
-        <w:t>、总结</w:t>
-      </w:r>
-    </w:p>
-    <w:p>
-      <w:pPr>
-        <w:pStyle w:val="FirstParagraph"/>
-        <w:spacing w:line="276" w:lineRule="auto"/>
-      </w:pPr>
-      <w:r>
-        <w:rPr>
-          <w:rFonts w:hint="eastAsia"/>
-        </w:rPr>
-        <w:t>教师作业批改助手通过</w:t>
-      </w:r>
-      <w:r>
-        <w:t xml:space="preserve"> Python</w:t>
-      </w:r>
-      <w:r>
-        <w:t>、</w:t>
-      </w:r>
-      <w:r>
-        <w:t xml:space="preserve">Streamlit </w:t>
-      </w:r>
-      <w:r>
-        <w:rPr>
-          <w:rFonts w:hint="eastAsia"/>
-        </w:rPr>
-        <w:t>和现有大模型</w:t>
-      </w:r>
-      <w:r>
-        <w:t xml:space="preserve"> </w:t>
-      </w:r>
-      <w:r>
-        <w:rPr>
-          <w:rFonts w:hint="eastAsia"/>
-        </w:rPr>
-        <w:t>API</w:t>
-      </w:r>
-      <w:r>
-        <w:rPr>
-          <w:rFonts w:hint="eastAsia"/>
-        </w:rPr>
-        <w:t>，实现了一个可运行、可部署、适合课程展示的</w:t>
-      </w:r>
-      <w:r>
-        <w:t xml:space="preserve"> AI Agent </w:t>
-      </w:r>
-      <w:r>
-        <w:rPr>
-          <w:rFonts w:hint="eastAsia"/>
-        </w:rPr>
-        <w:t>产品。</w:t>
-      </w:r>
-    </w:p>
-    <w:p>
-      <w:pPr>
-        <w:pStyle w:val="a0"/>
-        <w:spacing w:line="276" w:lineRule="auto"/>
-      </w:pPr>
-      <w:r>
-        <w:rPr>
-          <w:rFonts w:hint="eastAsia"/>
-        </w:rPr>
-        <w:t>产品的核心价值不在于简单调用大模型，而在于将提示词工程转化为完整产品机制：</w:t>
-      </w:r>
-    </w:p>
-    <w:p>
-      <w:pPr>
-        <w:pStyle w:val="Compact"/>
-        <w:numPr>
-          <w:ilvl w:val="0"/>
-          <w:numId w:val="44"/>
-        </w:numPr>
-        <w:spacing w:line="276" w:lineRule="auto"/>
-      </w:pPr>
-      <w:r>
-        <w:rPr>
-          <w:rFonts w:hint="eastAsia"/>
-        </w:rPr>
-        <w:t>使用课程化评分标准控制上下文。</w:t>
-      </w:r>
-    </w:p>
-    <w:p>
-      <w:pPr>
-        <w:pStyle w:val="Compact"/>
-        <w:numPr>
-          <w:ilvl w:val="0"/>
-          <w:numId w:val="44"/>
-        </w:numPr>
-        <w:spacing w:line="276" w:lineRule="auto"/>
-      </w:pPr>
-      <w:r>
-        <w:rPr>
-          <w:rFonts w:hint="eastAsia"/>
-        </w:rPr>
-        <w:t>使用任务分解提高输出完整性。</w:t>
-      </w:r>
-    </w:p>
-    <w:p>
-      <w:pPr>
-        <w:pStyle w:val="Compact"/>
-        <w:numPr>
-          <w:ilvl w:val="0"/>
-          <w:numId w:val="44"/>
-        </w:numPr>
-        <w:spacing w:line="276" w:lineRule="auto"/>
-      </w:pPr>
-      <w:r>
-        <w:rPr>
-          <w:rFonts w:hint="eastAsia"/>
-        </w:rPr>
-        <w:t>使用固定</w:t>
-      </w:r>
-      <w:r>
-        <w:t xml:space="preserve"> JSON </w:t>
-      </w:r>
-      <w:r>
-        <w:rPr>
-          <w:rFonts w:hint="eastAsia"/>
-        </w:rPr>
-        <w:t>提高结果稳定性。</w:t>
-      </w:r>
-    </w:p>
-    <w:p>
-      <w:pPr>
-        <w:pStyle w:val="Compact"/>
-        <w:numPr>
-          <w:ilvl w:val="0"/>
-          <w:numId w:val="44"/>
-        </w:numPr>
-        <w:spacing w:line="276" w:lineRule="auto"/>
-      </w:pPr>
-      <w:r>
-        <w:rPr>
-          <w:rFonts w:hint="eastAsia"/>
-        </w:rPr>
-        <w:t>使用教师权重保留教师评价权。</w:t>
-      </w:r>
-    </w:p>
-    <w:p>
-      <w:pPr>
-        <w:pStyle w:val="Compact"/>
-        <w:numPr>
-          <w:ilvl w:val="0"/>
-          <w:numId w:val="44"/>
-        </w:numPr>
-        <w:spacing w:line="276" w:lineRule="auto"/>
-      </w:pPr>
-      <w:r>
-        <w:rPr>
-          <w:rFonts w:hint="eastAsia"/>
-        </w:rPr>
-        <w:t>使用程序算分避免模型算术错误。</w:t>
-      </w:r>
-    </w:p>
-    <w:p>
-      <w:pPr>
-        <w:pStyle w:val="Compact"/>
-        <w:numPr>
-          <w:ilvl w:val="0"/>
-          <w:numId w:val="44"/>
-        </w:numPr>
-        <w:spacing w:line="276" w:lineRule="auto"/>
-      </w:pPr>
-      <w:r>
-        <w:rPr>
-          <w:rFonts w:hint="eastAsia"/>
-        </w:rPr>
-        <w:t>使用严重错误限分抑制评分虚高。</w:t>
-      </w:r>
-    </w:p>
-    <w:p>
-      <w:pPr>
-        <w:pStyle w:val="Compact"/>
-        <w:numPr>
-          <w:ilvl w:val="0"/>
-          <w:numId w:val="44"/>
-        </w:numPr>
-        <w:spacing w:line="276" w:lineRule="auto"/>
-      </w:pPr>
-      <w:r>
-        <w:rPr>
-          <w:rFonts w:hint="eastAsia"/>
-        </w:rPr>
-        <w:t>使用证据和建议提升反馈质量。</w:t>
-      </w:r>
-    </w:p>
-    <w:p>
-      <w:pPr>
-        <w:pStyle w:val="Compact"/>
-        <w:numPr>
-          <w:ilvl w:val="0"/>
-          <w:numId w:val="44"/>
-        </w:numPr>
-        <w:spacing w:line="276" w:lineRule="auto"/>
-      </w:pPr>
-      <w:r>
-        <w:rPr>
-          <w:rFonts w:hint="eastAsia"/>
-        </w:rPr>
-        <w:t>使用</w:t>
-      </w:r>
-      <w:r>
-        <w:t xml:space="preserve"> Mock </w:t>
-      </w:r>
-      <w:r>
-        <w:rPr>
-          <w:rFonts w:hint="eastAsia"/>
-        </w:rPr>
         <w:t>模式保证演示稳定性。</w:t>
       </w:r>
     </w:p>
@@ -12865,7 +12539,7 @@
         <w:pStyle w:val="Compact"/>
         <w:numPr>
           <w:ilvl w:val="0"/>
-          <w:numId w:val="44"/>
+          <w:numId w:val="41"/>
         </w:numPr>
         <w:spacing w:line="276" w:lineRule="auto"/>
       </w:pPr>
@@ -12877,7 +12551,7 @@
       </w:r>
     </w:p>
     <w:bookmarkEnd w:id="0"/>
-    <w:bookmarkEnd w:id="85"/>
+    <w:bookmarkEnd w:id="82"/>
     <w:p>
       <w:pPr>
         <w:pStyle w:val="FirstParagraph"/>
@@ -13080,178 +12754,6 @@
     </w:lvl>
     <w:lvl w:ilvl="8">
       <w:start w:val="1"/>
-      <w:numFmt w:val="decimal"/>
-      <w:lvlText w:val="%9."/>
-      <w:lvlJc w:val="left"/>
-      <w:pPr>
-        <w:ind w:left="6480" w:hanging="360"/>
-      </w:pPr>
-    </w:lvl>
-  </w:abstractNum>
-  <w:abstractNum w:abstractNumId="2" w15:restartNumberingAfterBreak="0">
-    <w:nsid w:val="00A99415"/>
-    <w:multiLevelType w:val="multilevel"/>
-    <w:tmpl w:val="FF02BE36"/>
-    <w:lvl w:ilvl="0">
-      <w:start w:val="5"/>
-      <w:numFmt w:val="decimal"/>
-      <w:lvlText w:val="%1."/>
-      <w:lvlJc w:val="left"/>
-      <w:pPr>
-        <w:ind w:left="720" w:hanging="360"/>
-      </w:pPr>
-    </w:lvl>
-    <w:lvl w:ilvl="1">
-      <w:start w:val="5"/>
-      <w:numFmt w:val="decimal"/>
-      <w:lvlText w:val="%2."/>
-      <w:lvlJc w:val="left"/>
-      <w:pPr>
-        <w:ind w:left="1440" w:hanging="360"/>
-      </w:pPr>
-    </w:lvl>
-    <w:lvl w:ilvl="2">
-      <w:start w:val="5"/>
-      <w:numFmt w:val="decimal"/>
-      <w:lvlText w:val="%3."/>
-      <w:lvlJc w:val="left"/>
-      <w:pPr>
-        <w:ind w:left="2160" w:hanging="360"/>
-      </w:pPr>
-    </w:lvl>
-    <w:lvl w:ilvl="3">
-      <w:start w:val="5"/>
-      <w:numFmt w:val="decimal"/>
-      <w:lvlText w:val="%4."/>
-      <w:lvlJc w:val="left"/>
-      <w:pPr>
-        <w:ind w:left="2880" w:hanging="360"/>
-      </w:pPr>
-    </w:lvl>
-    <w:lvl w:ilvl="4">
-      <w:start w:val="5"/>
-      <w:numFmt w:val="decimal"/>
-      <w:lvlText w:val="%5."/>
-      <w:lvlJc w:val="left"/>
-      <w:pPr>
-        <w:ind w:left="3600" w:hanging="360"/>
-      </w:pPr>
-    </w:lvl>
-    <w:lvl w:ilvl="5">
-      <w:start w:val="5"/>
-      <w:numFmt w:val="decimal"/>
-      <w:lvlText w:val="%6."/>
-      <w:lvlJc w:val="left"/>
-      <w:pPr>
-        <w:ind w:left="4320" w:hanging="360"/>
-      </w:pPr>
-    </w:lvl>
-    <w:lvl w:ilvl="6">
-      <w:start w:val="5"/>
-      <w:numFmt w:val="decimal"/>
-      <w:lvlText w:val="%7."/>
-      <w:lvlJc w:val="left"/>
-      <w:pPr>
-        <w:ind w:left="5040" w:hanging="360"/>
-      </w:pPr>
-    </w:lvl>
-    <w:lvl w:ilvl="7">
-      <w:start w:val="5"/>
-      <w:numFmt w:val="decimal"/>
-      <w:lvlText w:val="%8."/>
-      <w:lvlJc w:val="left"/>
-      <w:pPr>
-        <w:ind w:left="5760" w:hanging="360"/>
-      </w:pPr>
-    </w:lvl>
-    <w:lvl w:ilvl="8">
-      <w:start w:val="5"/>
-      <w:numFmt w:val="decimal"/>
-      <w:lvlText w:val="%9."/>
-      <w:lvlJc w:val="left"/>
-      <w:pPr>
-        <w:ind w:left="6480" w:hanging="360"/>
-      </w:pPr>
-    </w:lvl>
-  </w:abstractNum>
-  <w:abstractNum w:abstractNumId="3" w15:restartNumberingAfterBreak="0">
-    <w:nsid w:val="00A99416"/>
-    <w:multiLevelType w:val="multilevel"/>
-    <w:tmpl w:val="B21ED514"/>
-    <w:lvl w:ilvl="0">
-      <w:start w:val="6"/>
-      <w:numFmt w:val="decimal"/>
-      <w:lvlText w:val="%1."/>
-      <w:lvlJc w:val="left"/>
-      <w:pPr>
-        <w:ind w:left="720" w:hanging="360"/>
-      </w:pPr>
-    </w:lvl>
-    <w:lvl w:ilvl="1">
-      <w:start w:val="6"/>
-      <w:numFmt w:val="decimal"/>
-      <w:lvlText w:val="%2."/>
-      <w:lvlJc w:val="left"/>
-      <w:pPr>
-        <w:ind w:left="1440" w:hanging="360"/>
-      </w:pPr>
-    </w:lvl>
-    <w:lvl w:ilvl="2">
-      <w:start w:val="6"/>
-      <w:numFmt w:val="decimal"/>
-      <w:lvlText w:val="%3."/>
-      <w:lvlJc w:val="left"/>
-      <w:pPr>
-        <w:ind w:left="2160" w:hanging="360"/>
-      </w:pPr>
-    </w:lvl>
-    <w:lvl w:ilvl="3">
-      <w:start w:val="6"/>
-      <w:numFmt w:val="decimal"/>
-      <w:lvlText w:val="%4."/>
-      <w:lvlJc w:val="left"/>
-      <w:pPr>
-        <w:ind w:left="2880" w:hanging="360"/>
-      </w:pPr>
-    </w:lvl>
-    <w:lvl w:ilvl="4">
-      <w:start w:val="6"/>
-      <w:numFmt w:val="decimal"/>
-      <w:lvlText w:val="%5."/>
-      <w:lvlJc w:val="left"/>
-      <w:pPr>
-        <w:ind w:left="3600" w:hanging="360"/>
-      </w:pPr>
-    </w:lvl>
-    <w:lvl w:ilvl="5">
-      <w:start w:val="6"/>
-      <w:numFmt w:val="decimal"/>
-      <w:lvlText w:val="%6."/>
-      <w:lvlJc w:val="left"/>
-      <w:pPr>
-        <w:ind w:left="4320" w:hanging="360"/>
-      </w:pPr>
-    </w:lvl>
-    <w:lvl w:ilvl="6">
-      <w:start w:val="6"/>
-      <w:numFmt w:val="decimal"/>
-      <w:lvlText w:val="%7."/>
-      <w:lvlJc w:val="left"/>
-      <w:pPr>
-        <w:ind w:left="5040" w:hanging="360"/>
-      </w:pPr>
-    </w:lvl>
-    <w:lvl w:ilvl="7">
-      <w:start w:val="6"/>
-      <w:numFmt w:val="decimal"/>
-      <w:lvlText w:val="%8."/>
-      <w:lvlJc w:val="left"/>
-      <w:pPr>
-        <w:ind w:left="5760" w:hanging="360"/>
-      </w:pPr>
-    </w:lvl>
-    <w:lvl w:ilvl="8">
-      <w:start w:val="6"/>
       <w:numFmt w:val="decimal"/>
       <w:lvlText w:val="%9."/>
       <w:lvlJc w:val="left"/>
@@ -13647,103 +13149,13 @@
   <w:num w:numId="39" w16cid:durableId="1088117978">
     <w:abstractNumId w:val="0"/>
   </w:num>
-  <w:num w:numId="40" w16cid:durableId="1325477582">
-    <w:abstractNumId w:val="1"/>
-    <w:lvlOverride w:ilvl="0">
-      <w:startOverride w:val="1"/>
-    </w:lvlOverride>
-    <w:lvlOverride w:ilvl="1">
-      <w:startOverride w:val="1"/>
-    </w:lvlOverride>
-    <w:lvlOverride w:ilvl="2">
-      <w:startOverride w:val="1"/>
-    </w:lvlOverride>
-    <w:lvlOverride w:ilvl="3">
-      <w:startOverride w:val="1"/>
-    </w:lvlOverride>
-    <w:lvlOverride w:ilvl="4">
-      <w:startOverride w:val="1"/>
-    </w:lvlOverride>
-    <w:lvlOverride w:ilvl="5">
-      <w:startOverride w:val="1"/>
-    </w:lvlOverride>
-    <w:lvlOverride w:ilvl="6">
-      <w:startOverride w:val="1"/>
-    </w:lvlOverride>
-    <w:lvlOverride w:ilvl="7">
-      <w:startOverride w:val="1"/>
-    </w:lvlOverride>
-    <w:lvlOverride w:ilvl="8">
-      <w:startOverride w:val="1"/>
-    </w:lvlOverride>
-  </w:num>
-  <w:num w:numId="41" w16cid:durableId="1066221598">
-    <w:abstractNumId w:val="2"/>
-    <w:lvlOverride w:ilvl="0">
-      <w:startOverride w:val="5"/>
-    </w:lvlOverride>
-    <w:lvlOverride w:ilvl="1">
-      <w:startOverride w:val="5"/>
-    </w:lvlOverride>
-    <w:lvlOverride w:ilvl="2">
-      <w:startOverride w:val="5"/>
-    </w:lvlOverride>
-    <w:lvlOverride w:ilvl="3">
-      <w:startOverride w:val="5"/>
-    </w:lvlOverride>
-    <w:lvlOverride w:ilvl="4">
-      <w:startOverride w:val="5"/>
-    </w:lvlOverride>
-    <w:lvlOverride w:ilvl="5">
-      <w:startOverride w:val="5"/>
-    </w:lvlOverride>
-    <w:lvlOverride w:ilvl="6">
-      <w:startOverride w:val="5"/>
-    </w:lvlOverride>
-    <w:lvlOverride w:ilvl="7">
-      <w:startOverride w:val="5"/>
-    </w:lvlOverride>
-    <w:lvlOverride w:ilvl="8">
-      <w:startOverride w:val="5"/>
-    </w:lvlOverride>
-  </w:num>
-  <w:num w:numId="42" w16cid:durableId="629366051">
-    <w:abstractNumId w:val="3"/>
-    <w:lvlOverride w:ilvl="0">
-      <w:startOverride w:val="6"/>
-    </w:lvlOverride>
-    <w:lvlOverride w:ilvl="1">
-      <w:startOverride w:val="6"/>
-    </w:lvlOverride>
-    <w:lvlOverride w:ilvl="2">
-      <w:startOverride w:val="6"/>
-    </w:lvlOverride>
-    <w:lvlOverride w:ilvl="3">
-      <w:startOverride w:val="6"/>
-    </w:lvlOverride>
-    <w:lvlOverride w:ilvl="4">
-      <w:startOverride w:val="6"/>
-    </w:lvlOverride>
-    <w:lvlOverride w:ilvl="5">
-      <w:startOverride w:val="6"/>
-    </w:lvlOverride>
-    <w:lvlOverride w:ilvl="6">
-      <w:startOverride w:val="6"/>
-    </w:lvlOverride>
-    <w:lvlOverride w:ilvl="7">
-      <w:startOverride w:val="6"/>
-    </w:lvlOverride>
-    <w:lvlOverride w:ilvl="8">
-      <w:startOverride w:val="6"/>
-    </w:lvlOverride>
-  </w:num>
-  <w:num w:numId="43" w16cid:durableId="1327250148">
+  <w:num w:numId="40" w16cid:durableId="1327250148">
     <w:abstractNumId w:val="0"/>
   </w:num>
-  <w:num w:numId="44" w16cid:durableId="842092995">
+  <w:num w:numId="41" w16cid:durableId="842092995">
     <w:abstractNumId w:val="0"/>
   </w:num>
-  <w:numIdMacAtCleanup w:val="44"/>
+  <w:numIdMacAtCleanup w:val="41"/>
 </w:numbering>
 </file>
 
@@ -14213,7 +13625,6 @@
   <w:style w:type="character" w:default="1" w:styleId="a1">
     <w:name w:val="Default Paragraph Font"/>
     <w:uiPriority w:val="1"/>
-    <w:semiHidden/>
     <w:unhideWhenUsed/>
   </w:style>
   <w:style w:type="table" w:default="1" w:styleId="a2">
@@ -14954,6 +14365,18 @@
       <w:sz w:val="22"/>
     </w:rPr>
   </w:style>
+  <w:style w:type="character" w:styleId="af0">
+    <w:name w:val="Unresolved Mention"/>
+    <w:basedOn w:val="a1"/>
+    <w:uiPriority w:val="99"/>
+    <w:semiHidden/>
+    <w:unhideWhenUsed/>
+    <w:rsid w:val="002D71B6"/>
+    <w:rPr>
+      <w:color w:val="605E5C"/>
+      <w:shd w:val="clear" w:color="auto" w:fill="E1DFDD"/>
+    </w:rPr>
+  </w:style>
 </w:styles>
 </file>
 

</xml_diff>